<commit_message>
docs/architecture: update ERD and source docx for this session's schema fixes
Regenerates Figure2_Database_ERD.png from a new .dot source (added),
matching the current data-model.md (adds document_url to dmer_document,
renames last_page -> last_cursor on poll_checkpoint).

Applies the same corrections to the master architecture docx as real
Word tracked changes (w:ins/w:del), not plain text replacement, so the
edits show up in Word's Review pane and can be accepted/rejected there:
  - last_page -> last_cursor (3 occurrences)
  - remove correlation_id from the dmer_document field list and delete
    the JSON example line referencing it
  - swap the embedded Figure 2 image for the regenerated ERD and resize
    to its new aspect ratio

Co-Authored-By: Claude Sonnet 5 <noreply@anthropic.com>
</commit_message>
<xml_diff>
--- a/docs/architecture/DMER_Intake_Automation_Revised_Architecture.docx
+++ b/docs/architecture/DMER_Intake_Automation_Revised_Architecture.docx
@@ -431,11 +431,7 @@
           </w:pPr>
           <w:r>
             <w:fldChar w:fldCharType="begin"/>
-          </w:r>
-          <w:r>
             <w:instrText>TOC \h \o "1-3"</w:instrText>
-          </w:r>
-          <w:r>
             <w:fldChar w:fldCharType="separate"/>
           </w:r>
           <w:hyperlink w:anchor="_Toc240729573" w:history="1">
@@ -451,40 +447,10 @@
                 <w:noProof/>
               </w:rPr>
               <w:tab/>
-            </w:r>
-            <w:r>
-              <w:rPr>
-                <w:noProof/>
-              </w:rPr>
               <w:fldChar w:fldCharType="begin"/>
-            </w:r>
-            <w:r>
-              <w:rPr>
-                <w:noProof/>
-              </w:rPr>
               <w:instrText xml:space="preserve"> PAGEREF _Toc240729573 \h </w:instrText>
-            </w:r>
-            <w:r>
-              <w:rPr>
-                <w:noProof/>
-              </w:rPr>
-            </w:r>
-            <w:r>
-              <w:rPr>
-                <w:noProof/>
-              </w:rPr>
               <w:fldChar w:fldCharType="separate"/>
-            </w:r>
-            <w:r>
-              <w:rPr>
-                <w:noProof/>
-              </w:rPr>
               <w:t>2</w:t>
-            </w:r>
-            <w:r>
-              <w:rPr>
-                <w:noProof/>
-              </w:rPr>
               <w:fldChar w:fldCharType="end"/>
             </w:r>
           </w:hyperlink>
@@ -512,40 +478,10 @@
                 <w:noProof/>
               </w:rPr>
               <w:tab/>
-            </w:r>
-            <w:r>
-              <w:rPr>
-                <w:noProof/>
-              </w:rPr>
               <w:fldChar w:fldCharType="begin"/>
-            </w:r>
-            <w:r>
-              <w:rPr>
-                <w:noProof/>
-              </w:rPr>
               <w:instrText xml:space="preserve"> PAGEREF _Toc240729574 \h </w:instrText>
-            </w:r>
-            <w:r>
-              <w:rPr>
-                <w:noProof/>
-              </w:rPr>
-            </w:r>
-            <w:r>
-              <w:rPr>
-                <w:noProof/>
-              </w:rPr>
               <w:fldChar w:fldCharType="separate"/>
-            </w:r>
-            <w:r>
-              <w:rPr>
-                <w:noProof/>
-              </w:rPr>
               <w:t>4</w:t>
-            </w:r>
-            <w:r>
-              <w:rPr>
-                <w:noProof/>
-              </w:rPr>
               <w:fldChar w:fldCharType="end"/>
             </w:r>
           </w:hyperlink>
@@ -573,40 +509,10 @@
                 <w:noProof/>
               </w:rPr>
               <w:tab/>
-            </w:r>
-            <w:r>
-              <w:rPr>
-                <w:noProof/>
-              </w:rPr>
               <w:fldChar w:fldCharType="begin"/>
-            </w:r>
-            <w:r>
-              <w:rPr>
-                <w:noProof/>
-              </w:rPr>
               <w:instrText xml:space="preserve"> PAGEREF _Toc240729575 \h </w:instrText>
-            </w:r>
-            <w:r>
-              <w:rPr>
-                <w:noProof/>
-              </w:rPr>
-            </w:r>
-            <w:r>
-              <w:rPr>
-                <w:noProof/>
-              </w:rPr>
               <w:fldChar w:fldCharType="separate"/>
-            </w:r>
-            <w:r>
-              <w:rPr>
-                <w:noProof/>
-              </w:rPr>
               <w:t>4</w:t>
-            </w:r>
-            <w:r>
-              <w:rPr>
-                <w:noProof/>
-              </w:rPr>
               <w:fldChar w:fldCharType="end"/>
             </w:r>
           </w:hyperlink>
@@ -634,40 +540,10 @@
                 <w:noProof/>
               </w:rPr>
               <w:tab/>
-            </w:r>
-            <w:r>
-              <w:rPr>
-                <w:noProof/>
-              </w:rPr>
               <w:fldChar w:fldCharType="begin"/>
-            </w:r>
-            <w:r>
-              <w:rPr>
-                <w:noProof/>
-              </w:rPr>
               <w:instrText xml:space="preserve"> PAGEREF _Toc240729576 \h </w:instrText>
-            </w:r>
-            <w:r>
-              <w:rPr>
-                <w:noProof/>
-              </w:rPr>
-            </w:r>
-            <w:r>
-              <w:rPr>
-                <w:noProof/>
-              </w:rPr>
               <w:fldChar w:fldCharType="separate"/>
-            </w:r>
-            <w:r>
-              <w:rPr>
-                <w:noProof/>
-              </w:rPr>
               <w:t>6</w:t>
-            </w:r>
-            <w:r>
-              <w:rPr>
-                <w:noProof/>
-              </w:rPr>
               <w:fldChar w:fldCharType="end"/>
             </w:r>
           </w:hyperlink>
@@ -695,40 +571,10 @@
                 <w:noProof/>
               </w:rPr>
               <w:tab/>
-            </w:r>
-            <w:r>
-              <w:rPr>
-                <w:noProof/>
-              </w:rPr>
               <w:fldChar w:fldCharType="begin"/>
-            </w:r>
-            <w:r>
-              <w:rPr>
-                <w:noProof/>
-              </w:rPr>
               <w:instrText xml:space="preserve"> PAGEREF _Toc240729577 \h </w:instrText>
-            </w:r>
-            <w:r>
-              <w:rPr>
-                <w:noProof/>
-              </w:rPr>
-            </w:r>
-            <w:r>
-              <w:rPr>
-                <w:noProof/>
-              </w:rPr>
               <w:fldChar w:fldCharType="separate"/>
-            </w:r>
-            <w:r>
-              <w:rPr>
-                <w:noProof/>
-              </w:rPr>
               <w:t>8</w:t>
-            </w:r>
-            <w:r>
-              <w:rPr>
-                <w:noProof/>
-              </w:rPr>
               <w:fldChar w:fldCharType="end"/>
             </w:r>
           </w:hyperlink>
@@ -756,40 +602,10 @@
                 <w:noProof/>
               </w:rPr>
               <w:tab/>
-            </w:r>
-            <w:r>
-              <w:rPr>
-                <w:noProof/>
-              </w:rPr>
               <w:fldChar w:fldCharType="begin"/>
-            </w:r>
-            <w:r>
-              <w:rPr>
-                <w:noProof/>
-              </w:rPr>
               <w:instrText xml:space="preserve"> PAGEREF _Toc240729578 \h </w:instrText>
-            </w:r>
-            <w:r>
-              <w:rPr>
-                <w:noProof/>
-              </w:rPr>
-            </w:r>
-            <w:r>
-              <w:rPr>
-                <w:noProof/>
-              </w:rPr>
               <w:fldChar w:fldCharType="separate"/>
-            </w:r>
-            <w:r>
-              <w:rPr>
-                <w:noProof/>
-              </w:rPr>
               <w:t>8</w:t>
-            </w:r>
-            <w:r>
-              <w:rPr>
-                <w:noProof/>
-              </w:rPr>
               <w:fldChar w:fldCharType="end"/>
             </w:r>
           </w:hyperlink>
@@ -817,40 +633,10 @@
                 <w:noProof/>
               </w:rPr>
               <w:tab/>
-            </w:r>
-            <w:r>
-              <w:rPr>
-                <w:noProof/>
-              </w:rPr>
               <w:fldChar w:fldCharType="begin"/>
-            </w:r>
-            <w:r>
-              <w:rPr>
-                <w:noProof/>
-              </w:rPr>
               <w:instrText xml:space="preserve"> PAGEREF _Toc240729579 \h </w:instrText>
-            </w:r>
-            <w:r>
-              <w:rPr>
-                <w:noProof/>
-              </w:rPr>
-            </w:r>
-            <w:r>
-              <w:rPr>
-                <w:noProof/>
-              </w:rPr>
               <w:fldChar w:fldCharType="separate"/>
-            </w:r>
-            <w:r>
-              <w:rPr>
-                <w:noProof/>
-              </w:rPr>
               <w:t>9</w:t>
-            </w:r>
-            <w:r>
-              <w:rPr>
-                <w:noProof/>
-              </w:rPr>
               <w:fldChar w:fldCharType="end"/>
             </w:r>
           </w:hyperlink>
@@ -878,40 +664,10 @@
                 <w:noProof/>
               </w:rPr>
               <w:tab/>
-            </w:r>
-            <w:r>
-              <w:rPr>
-                <w:noProof/>
-              </w:rPr>
               <w:fldChar w:fldCharType="begin"/>
-            </w:r>
-            <w:r>
-              <w:rPr>
-                <w:noProof/>
-              </w:rPr>
               <w:instrText xml:space="preserve"> PAGEREF _Toc240729580 \h </w:instrText>
-            </w:r>
-            <w:r>
-              <w:rPr>
-                <w:noProof/>
-              </w:rPr>
-            </w:r>
-            <w:r>
-              <w:rPr>
-                <w:noProof/>
-              </w:rPr>
               <w:fldChar w:fldCharType="separate"/>
-            </w:r>
-            <w:r>
-              <w:rPr>
-                <w:noProof/>
-              </w:rPr>
               <w:t>9</w:t>
-            </w:r>
-            <w:r>
-              <w:rPr>
-                <w:noProof/>
-              </w:rPr>
               <w:fldChar w:fldCharType="end"/>
             </w:r>
           </w:hyperlink>
@@ -939,40 +695,10 @@
                 <w:noProof/>
               </w:rPr>
               <w:tab/>
-            </w:r>
-            <w:r>
-              <w:rPr>
-                <w:noProof/>
-              </w:rPr>
               <w:fldChar w:fldCharType="begin"/>
-            </w:r>
-            <w:r>
-              <w:rPr>
-                <w:noProof/>
-              </w:rPr>
               <w:instrText xml:space="preserve"> PAGEREF _Toc240729581 \h </w:instrText>
-            </w:r>
-            <w:r>
-              <w:rPr>
-                <w:noProof/>
-              </w:rPr>
-            </w:r>
-            <w:r>
-              <w:rPr>
-                <w:noProof/>
-              </w:rPr>
               <w:fldChar w:fldCharType="separate"/>
-            </w:r>
-            <w:r>
-              <w:rPr>
-                <w:noProof/>
-              </w:rPr>
               <w:t>9</w:t>
-            </w:r>
-            <w:r>
-              <w:rPr>
-                <w:noProof/>
-              </w:rPr>
               <w:fldChar w:fldCharType="end"/>
             </w:r>
           </w:hyperlink>
@@ -1000,40 +726,10 @@
                 <w:noProof/>
               </w:rPr>
               <w:tab/>
-            </w:r>
-            <w:r>
-              <w:rPr>
-                <w:noProof/>
-              </w:rPr>
               <w:fldChar w:fldCharType="begin"/>
-            </w:r>
-            <w:r>
-              <w:rPr>
-                <w:noProof/>
-              </w:rPr>
               <w:instrText xml:space="preserve"> PAGEREF _Toc240729582 \h </w:instrText>
-            </w:r>
-            <w:r>
-              <w:rPr>
-                <w:noProof/>
-              </w:rPr>
-            </w:r>
-            <w:r>
-              <w:rPr>
-                <w:noProof/>
-              </w:rPr>
               <w:fldChar w:fldCharType="separate"/>
-            </w:r>
-            <w:r>
-              <w:rPr>
-                <w:noProof/>
-              </w:rPr>
               <w:t>10</w:t>
-            </w:r>
-            <w:r>
-              <w:rPr>
-                <w:noProof/>
-              </w:rPr>
               <w:fldChar w:fldCharType="end"/>
             </w:r>
           </w:hyperlink>
@@ -1061,40 +757,10 @@
                 <w:noProof/>
               </w:rPr>
               <w:tab/>
-            </w:r>
-            <w:r>
-              <w:rPr>
-                <w:noProof/>
-              </w:rPr>
               <w:fldChar w:fldCharType="begin"/>
-            </w:r>
-            <w:r>
-              <w:rPr>
-                <w:noProof/>
-              </w:rPr>
               <w:instrText xml:space="preserve"> PAGEREF _Toc240729583 \h </w:instrText>
-            </w:r>
-            <w:r>
-              <w:rPr>
-                <w:noProof/>
-              </w:rPr>
-            </w:r>
-            <w:r>
-              <w:rPr>
-                <w:noProof/>
-              </w:rPr>
               <w:fldChar w:fldCharType="separate"/>
-            </w:r>
-            <w:r>
-              <w:rPr>
-                <w:noProof/>
-              </w:rPr>
               <w:t>11</w:t>
-            </w:r>
-            <w:r>
-              <w:rPr>
-                <w:noProof/>
-              </w:rPr>
               <w:fldChar w:fldCharType="end"/>
             </w:r>
           </w:hyperlink>
@@ -1122,40 +788,10 @@
                 <w:noProof/>
               </w:rPr>
               <w:tab/>
-            </w:r>
-            <w:r>
-              <w:rPr>
-                <w:noProof/>
-              </w:rPr>
               <w:fldChar w:fldCharType="begin"/>
-            </w:r>
-            <w:r>
-              <w:rPr>
-                <w:noProof/>
-              </w:rPr>
               <w:instrText xml:space="preserve"> PAGEREF _Toc240729584 \h </w:instrText>
-            </w:r>
-            <w:r>
-              <w:rPr>
-                <w:noProof/>
-              </w:rPr>
-            </w:r>
-            <w:r>
-              <w:rPr>
-                <w:noProof/>
-              </w:rPr>
               <w:fldChar w:fldCharType="separate"/>
-            </w:r>
-            <w:r>
-              <w:rPr>
-                <w:noProof/>
-              </w:rPr>
               <w:t>14</w:t>
-            </w:r>
-            <w:r>
-              <w:rPr>
-                <w:noProof/>
-              </w:rPr>
               <w:fldChar w:fldCharType="end"/>
             </w:r>
           </w:hyperlink>
@@ -1183,40 +819,10 @@
                 <w:noProof/>
               </w:rPr>
               <w:tab/>
-            </w:r>
-            <w:r>
-              <w:rPr>
-                <w:noProof/>
-              </w:rPr>
               <w:fldChar w:fldCharType="begin"/>
-            </w:r>
-            <w:r>
-              <w:rPr>
-                <w:noProof/>
-              </w:rPr>
               <w:instrText xml:space="preserve"> PAGEREF _Toc240729585 \h </w:instrText>
-            </w:r>
-            <w:r>
-              <w:rPr>
-                <w:noProof/>
-              </w:rPr>
-            </w:r>
-            <w:r>
-              <w:rPr>
-                <w:noProof/>
-              </w:rPr>
               <w:fldChar w:fldCharType="separate"/>
-            </w:r>
-            <w:r>
-              <w:rPr>
-                <w:noProof/>
-              </w:rPr>
               <w:t>14</w:t>
-            </w:r>
-            <w:r>
-              <w:rPr>
-                <w:noProof/>
-              </w:rPr>
               <w:fldChar w:fldCharType="end"/>
             </w:r>
           </w:hyperlink>
@@ -1244,40 +850,10 @@
                 <w:noProof/>
               </w:rPr>
               <w:tab/>
-            </w:r>
-            <w:r>
-              <w:rPr>
-                <w:noProof/>
-              </w:rPr>
               <w:fldChar w:fldCharType="begin"/>
-            </w:r>
-            <w:r>
-              <w:rPr>
-                <w:noProof/>
-              </w:rPr>
               <w:instrText xml:space="preserve"> PAGEREF _Toc240729586 \h </w:instrText>
-            </w:r>
-            <w:r>
-              <w:rPr>
-                <w:noProof/>
-              </w:rPr>
-            </w:r>
-            <w:r>
-              <w:rPr>
-                <w:noProof/>
-              </w:rPr>
               <w:fldChar w:fldCharType="separate"/>
-            </w:r>
-            <w:r>
-              <w:rPr>
-                <w:noProof/>
-              </w:rPr>
               <w:t>14</w:t>
-            </w:r>
-            <w:r>
-              <w:rPr>
-                <w:noProof/>
-              </w:rPr>
               <w:fldChar w:fldCharType="end"/>
             </w:r>
           </w:hyperlink>
@@ -1305,40 +881,10 @@
                 <w:noProof/>
               </w:rPr>
               <w:tab/>
-            </w:r>
-            <w:r>
-              <w:rPr>
-                <w:noProof/>
-              </w:rPr>
               <w:fldChar w:fldCharType="begin"/>
-            </w:r>
-            <w:r>
-              <w:rPr>
-                <w:noProof/>
-              </w:rPr>
               <w:instrText xml:space="preserve"> PAGEREF _Toc240729587 \h </w:instrText>
-            </w:r>
-            <w:r>
-              <w:rPr>
-                <w:noProof/>
-              </w:rPr>
-            </w:r>
-            <w:r>
-              <w:rPr>
-                <w:noProof/>
-              </w:rPr>
               <w:fldChar w:fldCharType="separate"/>
-            </w:r>
-            <w:r>
-              <w:rPr>
-                <w:noProof/>
-              </w:rPr>
               <w:t>15</w:t>
-            </w:r>
-            <w:r>
-              <w:rPr>
-                <w:noProof/>
-              </w:rPr>
               <w:fldChar w:fldCharType="end"/>
             </w:r>
           </w:hyperlink>
@@ -1366,40 +912,10 @@
                 <w:noProof/>
               </w:rPr>
               <w:tab/>
-            </w:r>
-            <w:r>
-              <w:rPr>
-                <w:noProof/>
-              </w:rPr>
               <w:fldChar w:fldCharType="begin"/>
-            </w:r>
-            <w:r>
-              <w:rPr>
-                <w:noProof/>
-              </w:rPr>
               <w:instrText xml:space="preserve"> PAGEREF _Toc240729588 \h </w:instrText>
-            </w:r>
-            <w:r>
-              <w:rPr>
-                <w:noProof/>
-              </w:rPr>
-            </w:r>
-            <w:r>
-              <w:rPr>
-                <w:noProof/>
-              </w:rPr>
               <w:fldChar w:fldCharType="separate"/>
-            </w:r>
-            <w:r>
-              <w:rPr>
-                <w:noProof/>
-              </w:rPr>
               <w:t>16</w:t>
-            </w:r>
-            <w:r>
-              <w:rPr>
-                <w:noProof/>
-              </w:rPr>
               <w:fldChar w:fldCharType="end"/>
             </w:r>
           </w:hyperlink>
@@ -1427,40 +943,10 @@
                 <w:noProof/>
               </w:rPr>
               <w:tab/>
-            </w:r>
-            <w:r>
-              <w:rPr>
-                <w:noProof/>
-              </w:rPr>
               <w:fldChar w:fldCharType="begin"/>
-            </w:r>
-            <w:r>
-              <w:rPr>
-                <w:noProof/>
-              </w:rPr>
               <w:instrText xml:space="preserve"> PAGEREF _Toc240729589 \h </w:instrText>
-            </w:r>
-            <w:r>
-              <w:rPr>
-                <w:noProof/>
-              </w:rPr>
-            </w:r>
-            <w:r>
-              <w:rPr>
-                <w:noProof/>
-              </w:rPr>
               <w:fldChar w:fldCharType="separate"/>
-            </w:r>
-            <w:r>
-              <w:rPr>
-                <w:noProof/>
-              </w:rPr>
               <w:t>16</w:t>
-            </w:r>
-            <w:r>
-              <w:rPr>
-                <w:noProof/>
-              </w:rPr>
               <w:fldChar w:fldCharType="end"/>
             </w:r>
           </w:hyperlink>
@@ -1488,40 +974,10 @@
                 <w:noProof/>
               </w:rPr>
               <w:tab/>
-            </w:r>
-            <w:r>
-              <w:rPr>
-                <w:noProof/>
-              </w:rPr>
               <w:fldChar w:fldCharType="begin"/>
-            </w:r>
-            <w:r>
-              <w:rPr>
-                <w:noProof/>
-              </w:rPr>
               <w:instrText xml:space="preserve"> PAGEREF _Toc240729590 \h </w:instrText>
-            </w:r>
-            <w:r>
-              <w:rPr>
-                <w:noProof/>
-              </w:rPr>
-            </w:r>
-            <w:r>
-              <w:rPr>
-                <w:noProof/>
-              </w:rPr>
               <w:fldChar w:fldCharType="separate"/>
-            </w:r>
-            <w:r>
-              <w:rPr>
-                <w:noProof/>
-              </w:rPr>
               <w:t>16</w:t>
-            </w:r>
-            <w:r>
-              <w:rPr>
-                <w:noProof/>
-              </w:rPr>
               <w:fldChar w:fldCharType="end"/>
             </w:r>
           </w:hyperlink>
@@ -1549,40 +1005,10 @@
                 <w:noProof/>
               </w:rPr>
               <w:tab/>
-            </w:r>
-            <w:r>
-              <w:rPr>
-                <w:noProof/>
-              </w:rPr>
               <w:fldChar w:fldCharType="begin"/>
-            </w:r>
-            <w:r>
-              <w:rPr>
-                <w:noProof/>
-              </w:rPr>
               <w:instrText xml:space="preserve"> PAGEREF _Toc240729591 \h </w:instrText>
-            </w:r>
-            <w:r>
-              <w:rPr>
-                <w:noProof/>
-              </w:rPr>
-            </w:r>
-            <w:r>
-              <w:rPr>
-                <w:noProof/>
-              </w:rPr>
               <w:fldChar w:fldCharType="separate"/>
-            </w:r>
-            <w:r>
-              <w:rPr>
-                <w:noProof/>
-              </w:rPr>
               <w:t>17</w:t>
-            </w:r>
-            <w:r>
-              <w:rPr>
-                <w:noProof/>
-              </w:rPr>
               <w:fldChar w:fldCharType="end"/>
             </w:r>
           </w:hyperlink>
@@ -1610,40 +1036,10 @@
                 <w:noProof/>
               </w:rPr>
               <w:tab/>
-            </w:r>
-            <w:r>
-              <w:rPr>
-                <w:noProof/>
-              </w:rPr>
               <w:fldChar w:fldCharType="begin"/>
-            </w:r>
-            <w:r>
-              <w:rPr>
-                <w:noProof/>
-              </w:rPr>
               <w:instrText xml:space="preserve"> PAGEREF _Toc240729592 \h </w:instrText>
-            </w:r>
-            <w:r>
-              <w:rPr>
-                <w:noProof/>
-              </w:rPr>
-            </w:r>
-            <w:r>
-              <w:rPr>
-                <w:noProof/>
-              </w:rPr>
               <w:fldChar w:fldCharType="separate"/>
-            </w:r>
-            <w:r>
-              <w:rPr>
-                <w:noProof/>
-              </w:rPr>
               <w:t>18</w:t>
-            </w:r>
-            <w:r>
-              <w:rPr>
-                <w:noProof/>
-              </w:rPr>
               <w:fldChar w:fldCharType="end"/>
             </w:r>
           </w:hyperlink>
@@ -1671,40 +1067,10 @@
                 <w:noProof/>
               </w:rPr>
               <w:tab/>
-            </w:r>
-            <w:r>
-              <w:rPr>
-                <w:noProof/>
-              </w:rPr>
               <w:fldChar w:fldCharType="begin"/>
-            </w:r>
-            <w:r>
-              <w:rPr>
-                <w:noProof/>
-              </w:rPr>
               <w:instrText xml:space="preserve"> PAGEREF _Toc240729593 \h </w:instrText>
-            </w:r>
-            <w:r>
-              <w:rPr>
-                <w:noProof/>
-              </w:rPr>
-            </w:r>
-            <w:r>
-              <w:rPr>
-                <w:noProof/>
-              </w:rPr>
               <w:fldChar w:fldCharType="separate"/>
-            </w:r>
-            <w:r>
-              <w:rPr>
-                <w:noProof/>
-              </w:rPr>
               <w:t>19</w:t>
-            </w:r>
-            <w:r>
-              <w:rPr>
-                <w:noProof/>
-              </w:rPr>
               <w:fldChar w:fldCharType="end"/>
             </w:r>
           </w:hyperlink>
@@ -1732,40 +1098,10 @@
                 <w:noProof/>
               </w:rPr>
               <w:tab/>
-            </w:r>
-            <w:r>
-              <w:rPr>
-                <w:noProof/>
-              </w:rPr>
               <w:fldChar w:fldCharType="begin"/>
-            </w:r>
-            <w:r>
-              <w:rPr>
-                <w:noProof/>
-              </w:rPr>
               <w:instrText xml:space="preserve"> PAGEREF _Toc240729594 \h </w:instrText>
-            </w:r>
-            <w:r>
-              <w:rPr>
-                <w:noProof/>
-              </w:rPr>
-            </w:r>
-            <w:r>
-              <w:rPr>
-                <w:noProof/>
-              </w:rPr>
               <w:fldChar w:fldCharType="separate"/>
-            </w:r>
-            <w:r>
-              <w:rPr>
-                <w:noProof/>
-              </w:rPr>
               <w:t>19</w:t>
-            </w:r>
-            <w:r>
-              <w:rPr>
-                <w:noProof/>
-              </w:rPr>
               <w:fldChar w:fldCharType="end"/>
             </w:r>
           </w:hyperlink>
@@ -1793,40 +1129,10 @@
                 <w:noProof/>
               </w:rPr>
               <w:tab/>
-            </w:r>
-            <w:r>
-              <w:rPr>
-                <w:noProof/>
-              </w:rPr>
               <w:fldChar w:fldCharType="begin"/>
-            </w:r>
-            <w:r>
-              <w:rPr>
-                <w:noProof/>
-              </w:rPr>
               <w:instrText xml:space="preserve"> PAGEREF _Toc240729595 \h </w:instrText>
-            </w:r>
-            <w:r>
-              <w:rPr>
-                <w:noProof/>
-              </w:rPr>
-            </w:r>
-            <w:r>
-              <w:rPr>
-                <w:noProof/>
-              </w:rPr>
               <w:fldChar w:fldCharType="separate"/>
-            </w:r>
-            <w:r>
-              <w:rPr>
-                <w:noProof/>
-              </w:rPr>
               <w:t>20</w:t>
-            </w:r>
-            <w:r>
-              <w:rPr>
-                <w:noProof/>
-              </w:rPr>
               <w:fldChar w:fldCharType="end"/>
             </w:r>
           </w:hyperlink>
@@ -1854,40 +1160,10 @@
                 <w:noProof/>
               </w:rPr>
               <w:tab/>
-            </w:r>
-            <w:r>
-              <w:rPr>
-                <w:noProof/>
-              </w:rPr>
               <w:fldChar w:fldCharType="begin"/>
-            </w:r>
-            <w:r>
-              <w:rPr>
-                <w:noProof/>
-              </w:rPr>
               <w:instrText xml:space="preserve"> PAGEREF _Toc240729596 \h </w:instrText>
-            </w:r>
-            <w:r>
-              <w:rPr>
-                <w:noProof/>
-              </w:rPr>
-            </w:r>
-            <w:r>
-              <w:rPr>
-                <w:noProof/>
-              </w:rPr>
               <w:fldChar w:fldCharType="separate"/>
-            </w:r>
-            <w:r>
-              <w:rPr>
-                <w:noProof/>
-              </w:rPr>
               <w:t>20</w:t>
-            </w:r>
-            <w:r>
-              <w:rPr>
-                <w:noProof/>
-              </w:rPr>
               <w:fldChar w:fldCharType="end"/>
             </w:r>
           </w:hyperlink>
@@ -1915,40 +1191,10 @@
                 <w:noProof/>
               </w:rPr>
               <w:tab/>
-            </w:r>
-            <w:r>
-              <w:rPr>
-                <w:noProof/>
-              </w:rPr>
               <w:fldChar w:fldCharType="begin"/>
-            </w:r>
-            <w:r>
-              <w:rPr>
-                <w:noProof/>
-              </w:rPr>
               <w:instrText xml:space="preserve"> PAGEREF _Toc240729597 \h </w:instrText>
-            </w:r>
-            <w:r>
-              <w:rPr>
-                <w:noProof/>
-              </w:rPr>
-            </w:r>
-            <w:r>
-              <w:rPr>
-                <w:noProof/>
-              </w:rPr>
               <w:fldChar w:fldCharType="separate"/>
-            </w:r>
-            <w:r>
-              <w:rPr>
-                <w:noProof/>
-              </w:rPr>
               <w:t>20</w:t>
-            </w:r>
-            <w:r>
-              <w:rPr>
-                <w:noProof/>
-              </w:rPr>
               <w:fldChar w:fldCharType="end"/>
             </w:r>
           </w:hyperlink>
@@ -1976,40 +1222,10 @@
                 <w:noProof/>
               </w:rPr>
               <w:tab/>
-            </w:r>
-            <w:r>
-              <w:rPr>
-                <w:noProof/>
-              </w:rPr>
               <w:fldChar w:fldCharType="begin"/>
-            </w:r>
-            <w:r>
-              <w:rPr>
-                <w:noProof/>
-              </w:rPr>
               <w:instrText xml:space="preserve"> PAGEREF _Toc240729598 \h </w:instrText>
-            </w:r>
-            <w:r>
-              <w:rPr>
-                <w:noProof/>
-              </w:rPr>
-            </w:r>
-            <w:r>
-              <w:rPr>
-                <w:noProof/>
-              </w:rPr>
               <w:fldChar w:fldCharType="separate"/>
-            </w:r>
-            <w:r>
-              <w:rPr>
-                <w:noProof/>
-              </w:rPr>
               <w:t>22</w:t>
-            </w:r>
-            <w:r>
-              <w:rPr>
-                <w:noProof/>
-              </w:rPr>
               <w:fldChar w:fldCharType="end"/>
             </w:r>
           </w:hyperlink>
@@ -2037,40 +1253,10 @@
                 <w:noProof/>
               </w:rPr>
               <w:tab/>
-            </w:r>
-            <w:r>
-              <w:rPr>
-                <w:noProof/>
-              </w:rPr>
               <w:fldChar w:fldCharType="begin"/>
-            </w:r>
-            <w:r>
-              <w:rPr>
-                <w:noProof/>
-              </w:rPr>
               <w:instrText xml:space="preserve"> PAGEREF _Toc240729599 \h </w:instrText>
-            </w:r>
-            <w:r>
-              <w:rPr>
-                <w:noProof/>
-              </w:rPr>
-            </w:r>
-            <w:r>
-              <w:rPr>
-                <w:noProof/>
-              </w:rPr>
               <w:fldChar w:fldCharType="separate"/>
-            </w:r>
-            <w:r>
-              <w:rPr>
-                <w:noProof/>
-              </w:rPr>
               <w:t>22</w:t>
-            </w:r>
-            <w:r>
-              <w:rPr>
-                <w:noProof/>
-              </w:rPr>
               <w:fldChar w:fldCharType="end"/>
             </w:r>
           </w:hyperlink>
@@ -2098,40 +1284,10 @@
                 <w:noProof/>
               </w:rPr>
               <w:tab/>
-            </w:r>
-            <w:r>
-              <w:rPr>
-                <w:noProof/>
-              </w:rPr>
               <w:fldChar w:fldCharType="begin"/>
-            </w:r>
-            <w:r>
-              <w:rPr>
-                <w:noProof/>
-              </w:rPr>
               <w:instrText xml:space="preserve"> PAGEREF _Toc240729600 \h </w:instrText>
-            </w:r>
-            <w:r>
-              <w:rPr>
-                <w:noProof/>
-              </w:rPr>
-            </w:r>
-            <w:r>
-              <w:rPr>
-                <w:noProof/>
-              </w:rPr>
               <w:fldChar w:fldCharType="separate"/>
-            </w:r>
-            <w:r>
-              <w:rPr>
-                <w:noProof/>
-              </w:rPr>
               <w:t>22</w:t>
-            </w:r>
-            <w:r>
-              <w:rPr>
-                <w:noProof/>
-              </w:rPr>
               <w:fldChar w:fldCharType="end"/>
             </w:r>
           </w:hyperlink>
@@ -2159,40 +1315,10 @@
                 <w:noProof/>
               </w:rPr>
               <w:tab/>
-            </w:r>
-            <w:r>
-              <w:rPr>
-                <w:noProof/>
-              </w:rPr>
               <w:fldChar w:fldCharType="begin"/>
-            </w:r>
-            <w:r>
-              <w:rPr>
-                <w:noProof/>
-              </w:rPr>
               <w:instrText xml:space="preserve"> PAGEREF _Toc240729601 \h </w:instrText>
-            </w:r>
-            <w:r>
-              <w:rPr>
-                <w:noProof/>
-              </w:rPr>
-            </w:r>
-            <w:r>
-              <w:rPr>
-                <w:noProof/>
-              </w:rPr>
               <w:fldChar w:fldCharType="separate"/>
-            </w:r>
-            <w:r>
-              <w:rPr>
-                <w:noProof/>
-              </w:rPr>
               <w:t>22</w:t>
-            </w:r>
-            <w:r>
-              <w:rPr>
-                <w:noProof/>
-              </w:rPr>
               <w:fldChar w:fldCharType="end"/>
             </w:r>
           </w:hyperlink>
@@ -2220,40 +1346,10 @@
                 <w:noProof/>
               </w:rPr>
               <w:tab/>
-            </w:r>
-            <w:r>
-              <w:rPr>
-                <w:noProof/>
-              </w:rPr>
               <w:fldChar w:fldCharType="begin"/>
-            </w:r>
-            <w:r>
-              <w:rPr>
-                <w:noProof/>
-              </w:rPr>
               <w:instrText xml:space="preserve"> PAGEREF _Toc240729602 \h </w:instrText>
-            </w:r>
-            <w:r>
-              <w:rPr>
-                <w:noProof/>
-              </w:rPr>
-            </w:r>
-            <w:r>
-              <w:rPr>
-                <w:noProof/>
-              </w:rPr>
               <w:fldChar w:fldCharType="separate"/>
-            </w:r>
-            <w:r>
-              <w:rPr>
-                <w:noProof/>
-              </w:rPr>
               <w:t>23</w:t>
-            </w:r>
-            <w:r>
-              <w:rPr>
-                <w:noProof/>
-              </w:rPr>
               <w:fldChar w:fldCharType="end"/>
             </w:r>
           </w:hyperlink>
@@ -2281,40 +1377,10 @@
                 <w:noProof/>
               </w:rPr>
               <w:tab/>
-            </w:r>
-            <w:r>
-              <w:rPr>
-                <w:noProof/>
-              </w:rPr>
               <w:fldChar w:fldCharType="begin"/>
-            </w:r>
-            <w:r>
-              <w:rPr>
-                <w:noProof/>
-              </w:rPr>
               <w:instrText xml:space="preserve"> PAGEREF _Toc240729603 \h </w:instrText>
-            </w:r>
-            <w:r>
-              <w:rPr>
-                <w:noProof/>
-              </w:rPr>
-            </w:r>
-            <w:r>
-              <w:rPr>
-                <w:noProof/>
-              </w:rPr>
               <w:fldChar w:fldCharType="separate"/>
-            </w:r>
-            <w:r>
-              <w:rPr>
-                <w:noProof/>
-              </w:rPr>
               <w:t>23</w:t>
-            </w:r>
-            <w:r>
-              <w:rPr>
-                <w:noProof/>
-              </w:rPr>
               <w:fldChar w:fldCharType="end"/>
             </w:r>
           </w:hyperlink>
@@ -2342,40 +1408,10 @@
                 <w:noProof/>
               </w:rPr>
               <w:tab/>
-            </w:r>
-            <w:r>
-              <w:rPr>
-                <w:noProof/>
-              </w:rPr>
               <w:fldChar w:fldCharType="begin"/>
-            </w:r>
-            <w:r>
-              <w:rPr>
-                <w:noProof/>
-              </w:rPr>
               <w:instrText xml:space="preserve"> PAGEREF _Toc240729604 \h </w:instrText>
-            </w:r>
-            <w:r>
-              <w:rPr>
-                <w:noProof/>
-              </w:rPr>
-            </w:r>
-            <w:r>
-              <w:rPr>
-                <w:noProof/>
-              </w:rPr>
               <w:fldChar w:fldCharType="separate"/>
-            </w:r>
-            <w:r>
-              <w:rPr>
-                <w:noProof/>
-              </w:rPr>
               <w:t>23</w:t>
-            </w:r>
-            <w:r>
-              <w:rPr>
-                <w:noProof/>
-              </w:rPr>
               <w:fldChar w:fldCharType="end"/>
             </w:r>
           </w:hyperlink>
@@ -2403,40 +1439,10 @@
                 <w:noProof/>
               </w:rPr>
               <w:tab/>
-            </w:r>
-            <w:r>
-              <w:rPr>
-                <w:noProof/>
-              </w:rPr>
               <w:fldChar w:fldCharType="begin"/>
-            </w:r>
-            <w:r>
-              <w:rPr>
-                <w:noProof/>
-              </w:rPr>
               <w:instrText xml:space="preserve"> PAGEREF _Toc240729605 \h </w:instrText>
-            </w:r>
-            <w:r>
-              <w:rPr>
-                <w:noProof/>
-              </w:rPr>
-            </w:r>
-            <w:r>
-              <w:rPr>
-                <w:noProof/>
-              </w:rPr>
               <w:fldChar w:fldCharType="separate"/>
-            </w:r>
-            <w:r>
-              <w:rPr>
-                <w:noProof/>
-              </w:rPr>
               <w:t>25</w:t>
-            </w:r>
-            <w:r>
-              <w:rPr>
-                <w:noProof/>
-              </w:rPr>
               <w:fldChar w:fldCharType="end"/>
             </w:r>
           </w:hyperlink>
@@ -2464,40 +1470,10 @@
                 <w:noProof/>
               </w:rPr>
               <w:tab/>
-            </w:r>
-            <w:r>
-              <w:rPr>
-                <w:noProof/>
-              </w:rPr>
               <w:fldChar w:fldCharType="begin"/>
-            </w:r>
-            <w:r>
-              <w:rPr>
-                <w:noProof/>
-              </w:rPr>
               <w:instrText xml:space="preserve"> PAGEREF _Toc240729606 \h </w:instrText>
-            </w:r>
-            <w:r>
-              <w:rPr>
-                <w:noProof/>
-              </w:rPr>
-            </w:r>
-            <w:r>
-              <w:rPr>
-                <w:noProof/>
-              </w:rPr>
               <w:fldChar w:fldCharType="separate"/>
-            </w:r>
-            <w:r>
-              <w:rPr>
-                <w:noProof/>
-              </w:rPr>
               <w:t>27</w:t>
-            </w:r>
-            <w:r>
-              <w:rPr>
-                <w:noProof/>
-              </w:rPr>
               <w:fldChar w:fldCharType="end"/>
             </w:r>
           </w:hyperlink>
@@ -2525,40 +1501,10 @@
                 <w:noProof/>
               </w:rPr>
               <w:tab/>
-            </w:r>
-            <w:r>
-              <w:rPr>
-                <w:noProof/>
-              </w:rPr>
               <w:fldChar w:fldCharType="begin"/>
-            </w:r>
-            <w:r>
-              <w:rPr>
-                <w:noProof/>
-              </w:rPr>
               <w:instrText xml:space="preserve"> PAGEREF _Toc240729607 \h </w:instrText>
-            </w:r>
-            <w:r>
-              <w:rPr>
-                <w:noProof/>
-              </w:rPr>
-            </w:r>
-            <w:r>
-              <w:rPr>
-                <w:noProof/>
-              </w:rPr>
               <w:fldChar w:fldCharType="separate"/>
-            </w:r>
-            <w:r>
-              <w:rPr>
-                <w:noProof/>
-              </w:rPr>
               <w:t>27</w:t>
-            </w:r>
-            <w:r>
-              <w:rPr>
-                <w:noProof/>
-              </w:rPr>
               <w:fldChar w:fldCharType="end"/>
             </w:r>
           </w:hyperlink>
@@ -2586,40 +1532,10 @@
                 <w:noProof/>
               </w:rPr>
               <w:tab/>
-            </w:r>
-            <w:r>
-              <w:rPr>
-                <w:noProof/>
-              </w:rPr>
               <w:fldChar w:fldCharType="begin"/>
-            </w:r>
-            <w:r>
-              <w:rPr>
-                <w:noProof/>
-              </w:rPr>
               <w:instrText xml:space="preserve"> PAGEREF _Toc240729608 \h </w:instrText>
-            </w:r>
-            <w:r>
-              <w:rPr>
-                <w:noProof/>
-              </w:rPr>
-            </w:r>
-            <w:r>
-              <w:rPr>
-                <w:noProof/>
-              </w:rPr>
               <w:fldChar w:fldCharType="separate"/>
-            </w:r>
-            <w:r>
-              <w:rPr>
-                <w:noProof/>
-              </w:rPr>
               <w:t>29</w:t>
-            </w:r>
-            <w:r>
-              <w:rPr>
-                <w:noProof/>
-              </w:rPr>
               <w:fldChar w:fldCharType="end"/>
             </w:r>
           </w:hyperlink>
@@ -2647,40 +1563,10 @@
                 <w:noProof/>
               </w:rPr>
               <w:tab/>
-            </w:r>
-            <w:r>
-              <w:rPr>
-                <w:noProof/>
-              </w:rPr>
               <w:fldChar w:fldCharType="begin"/>
-            </w:r>
-            <w:r>
-              <w:rPr>
-                <w:noProof/>
-              </w:rPr>
               <w:instrText xml:space="preserve"> PAGEREF _Toc240729609 \h </w:instrText>
-            </w:r>
-            <w:r>
-              <w:rPr>
-                <w:noProof/>
-              </w:rPr>
-            </w:r>
-            <w:r>
-              <w:rPr>
-                <w:noProof/>
-              </w:rPr>
               <w:fldChar w:fldCharType="separate"/>
-            </w:r>
-            <w:r>
-              <w:rPr>
-                <w:noProof/>
-              </w:rPr>
               <w:t>30</w:t>
-            </w:r>
-            <w:r>
-              <w:rPr>
-                <w:noProof/>
-              </w:rPr>
               <w:fldChar w:fldCharType="end"/>
             </w:r>
           </w:hyperlink>
@@ -2708,40 +1594,10 @@
                 <w:noProof/>
               </w:rPr>
               <w:tab/>
-            </w:r>
-            <w:r>
-              <w:rPr>
-                <w:noProof/>
-              </w:rPr>
               <w:fldChar w:fldCharType="begin"/>
-            </w:r>
-            <w:r>
-              <w:rPr>
-                <w:noProof/>
-              </w:rPr>
               <w:instrText xml:space="preserve"> PAGEREF _Toc240729610 \h </w:instrText>
-            </w:r>
-            <w:r>
-              <w:rPr>
-                <w:noProof/>
-              </w:rPr>
-            </w:r>
-            <w:r>
-              <w:rPr>
-                <w:noProof/>
-              </w:rPr>
               <w:fldChar w:fldCharType="separate"/>
-            </w:r>
-            <w:r>
-              <w:rPr>
-                <w:noProof/>
-              </w:rPr>
               <w:t>30</w:t>
-            </w:r>
-            <w:r>
-              <w:rPr>
-                <w:noProof/>
-              </w:rPr>
               <w:fldChar w:fldCharType="end"/>
             </w:r>
           </w:hyperlink>
@@ -2769,40 +1625,10 @@
                 <w:noProof/>
               </w:rPr>
               <w:tab/>
-            </w:r>
-            <w:r>
-              <w:rPr>
-                <w:noProof/>
-              </w:rPr>
               <w:fldChar w:fldCharType="begin"/>
-            </w:r>
-            <w:r>
-              <w:rPr>
-                <w:noProof/>
-              </w:rPr>
               <w:instrText xml:space="preserve"> PAGEREF _Toc240729611 \h </w:instrText>
-            </w:r>
-            <w:r>
-              <w:rPr>
-                <w:noProof/>
-              </w:rPr>
-            </w:r>
-            <w:r>
-              <w:rPr>
-                <w:noProof/>
-              </w:rPr>
               <w:fldChar w:fldCharType="separate"/>
-            </w:r>
-            <w:r>
-              <w:rPr>
-                <w:noProof/>
-              </w:rPr>
               <w:t>30</w:t>
-            </w:r>
-            <w:r>
-              <w:rPr>
-                <w:noProof/>
-              </w:rPr>
               <w:fldChar w:fldCharType="end"/>
             </w:r>
           </w:hyperlink>
@@ -2830,40 +1656,10 @@
                 <w:noProof/>
               </w:rPr>
               <w:tab/>
-            </w:r>
-            <w:r>
-              <w:rPr>
-                <w:noProof/>
-              </w:rPr>
               <w:fldChar w:fldCharType="begin"/>
-            </w:r>
-            <w:r>
-              <w:rPr>
-                <w:noProof/>
-              </w:rPr>
               <w:instrText xml:space="preserve"> PAGEREF _Toc240729612 \h </w:instrText>
-            </w:r>
-            <w:r>
-              <w:rPr>
-                <w:noProof/>
-              </w:rPr>
-            </w:r>
-            <w:r>
-              <w:rPr>
-                <w:noProof/>
-              </w:rPr>
               <w:fldChar w:fldCharType="separate"/>
-            </w:r>
-            <w:r>
-              <w:rPr>
-                <w:noProof/>
-              </w:rPr>
               <w:t>30</w:t>
-            </w:r>
-            <w:r>
-              <w:rPr>
-                <w:noProof/>
-              </w:rPr>
               <w:fldChar w:fldCharType="end"/>
             </w:r>
           </w:hyperlink>
@@ -2891,40 +1687,10 @@
                 <w:noProof/>
               </w:rPr>
               <w:tab/>
-            </w:r>
-            <w:r>
-              <w:rPr>
-                <w:noProof/>
-              </w:rPr>
               <w:fldChar w:fldCharType="begin"/>
-            </w:r>
-            <w:r>
-              <w:rPr>
-                <w:noProof/>
-              </w:rPr>
               <w:instrText xml:space="preserve"> PAGEREF _Toc240729613 \h </w:instrText>
-            </w:r>
-            <w:r>
-              <w:rPr>
-                <w:noProof/>
-              </w:rPr>
-            </w:r>
-            <w:r>
-              <w:rPr>
-                <w:noProof/>
-              </w:rPr>
               <w:fldChar w:fldCharType="separate"/>
-            </w:r>
-            <w:r>
-              <w:rPr>
-                <w:noProof/>
-              </w:rPr>
               <w:t>30</w:t>
-            </w:r>
-            <w:r>
-              <w:rPr>
-                <w:noProof/>
-              </w:rPr>
               <w:fldChar w:fldCharType="end"/>
             </w:r>
           </w:hyperlink>
@@ -2952,40 +1718,10 @@
                 <w:noProof/>
               </w:rPr>
               <w:tab/>
-            </w:r>
-            <w:r>
-              <w:rPr>
-                <w:noProof/>
-              </w:rPr>
               <w:fldChar w:fldCharType="begin"/>
-            </w:r>
-            <w:r>
-              <w:rPr>
-                <w:noProof/>
-              </w:rPr>
               <w:instrText xml:space="preserve"> PAGEREF _Toc240729614 \h </w:instrText>
-            </w:r>
-            <w:r>
-              <w:rPr>
-                <w:noProof/>
-              </w:rPr>
-            </w:r>
-            <w:r>
-              <w:rPr>
-                <w:noProof/>
-              </w:rPr>
               <w:fldChar w:fldCharType="separate"/>
-            </w:r>
-            <w:r>
-              <w:rPr>
-                <w:noProof/>
-              </w:rPr>
               <w:t>31</w:t>
-            </w:r>
-            <w:r>
-              <w:rPr>
-                <w:noProof/>
-              </w:rPr>
               <w:fldChar w:fldCharType="end"/>
             </w:r>
           </w:hyperlink>
@@ -3013,40 +1749,10 @@
                 <w:noProof/>
               </w:rPr>
               <w:tab/>
-            </w:r>
-            <w:r>
-              <w:rPr>
-                <w:noProof/>
-              </w:rPr>
               <w:fldChar w:fldCharType="begin"/>
-            </w:r>
-            <w:r>
-              <w:rPr>
-                <w:noProof/>
-              </w:rPr>
               <w:instrText xml:space="preserve"> PAGEREF _Toc240729615 \h </w:instrText>
-            </w:r>
-            <w:r>
-              <w:rPr>
-                <w:noProof/>
-              </w:rPr>
-            </w:r>
-            <w:r>
-              <w:rPr>
-                <w:noProof/>
-              </w:rPr>
               <w:fldChar w:fldCharType="separate"/>
-            </w:r>
-            <w:r>
-              <w:rPr>
-                <w:noProof/>
-              </w:rPr>
               <w:t>32</w:t>
-            </w:r>
-            <w:r>
-              <w:rPr>
-                <w:noProof/>
-              </w:rPr>
               <w:fldChar w:fldCharType="end"/>
             </w:r>
           </w:hyperlink>
@@ -3074,40 +1780,10 @@
                 <w:noProof/>
               </w:rPr>
               <w:tab/>
-            </w:r>
-            <w:r>
-              <w:rPr>
-                <w:noProof/>
-              </w:rPr>
               <w:fldChar w:fldCharType="begin"/>
-            </w:r>
-            <w:r>
-              <w:rPr>
-                <w:noProof/>
-              </w:rPr>
               <w:instrText xml:space="preserve"> PAGEREF _Toc240729616 \h </w:instrText>
-            </w:r>
-            <w:r>
-              <w:rPr>
-                <w:noProof/>
-              </w:rPr>
-            </w:r>
-            <w:r>
-              <w:rPr>
-                <w:noProof/>
-              </w:rPr>
               <w:fldChar w:fldCharType="separate"/>
-            </w:r>
-            <w:r>
-              <w:rPr>
-                <w:noProof/>
-              </w:rPr>
               <w:t>32</w:t>
-            </w:r>
-            <w:r>
-              <w:rPr>
-                <w:noProof/>
-              </w:rPr>
               <w:fldChar w:fldCharType="end"/>
             </w:r>
           </w:hyperlink>
@@ -3135,40 +1811,10 @@
                 <w:noProof/>
               </w:rPr>
               <w:tab/>
-            </w:r>
-            <w:r>
-              <w:rPr>
-                <w:noProof/>
-              </w:rPr>
               <w:fldChar w:fldCharType="begin"/>
-            </w:r>
-            <w:r>
-              <w:rPr>
-                <w:noProof/>
-              </w:rPr>
               <w:instrText xml:space="preserve"> PAGEREF _Toc240729617 \h </w:instrText>
-            </w:r>
-            <w:r>
-              <w:rPr>
-                <w:noProof/>
-              </w:rPr>
-            </w:r>
-            <w:r>
-              <w:rPr>
-                <w:noProof/>
-              </w:rPr>
               <w:fldChar w:fldCharType="separate"/>
-            </w:r>
-            <w:r>
-              <w:rPr>
-                <w:noProof/>
-              </w:rPr>
               <w:t>32</w:t>
-            </w:r>
-            <w:r>
-              <w:rPr>
-                <w:noProof/>
-              </w:rPr>
               <w:fldChar w:fldCharType="end"/>
             </w:r>
           </w:hyperlink>
@@ -3196,40 +1842,10 @@
                 <w:noProof/>
               </w:rPr>
               <w:tab/>
-            </w:r>
-            <w:r>
-              <w:rPr>
-                <w:noProof/>
-              </w:rPr>
               <w:fldChar w:fldCharType="begin"/>
-            </w:r>
-            <w:r>
-              <w:rPr>
-                <w:noProof/>
-              </w:rPr>
               <w:instrText xml:space="preserve"> PAGEREF _Toc240729618 \h </w:instrText>
-            </w:r>
-            <w:r>
-              <w:rPr>
-                <w:noProof/>
-              </w:rPr>
-            </w:r>
-            <w:r>
-              <w:rPr>
-                <w:noProof/>
-              </w:rPr>
               <w:fldChar w:fldCharType="separate"/>
-            </w:r>
-            <w:r>
-              <w:rPr>
-                <w:noProof/>
-              </w:rPr>
               <w:t>32</w:t>
-            </w:r>
-            <w:r>
-              <w:rPr>
-                <w:noProof/>
-              </w:rPr>
               <w:fldChar w:fldCharType="end"/>
             </w:r>
           </w:hyperlink>
@@ -3257,40 +1873,10 @@
                 <w:noProof/>
               </w:rPr>
               <w:tab/>
-            </w:r>
-            <w:r>
-              <w:rPr>
-                <w:noProof/>
-              </w:rPr>
               <w:fldChar w:fldCharType="begin"/>
-            </w:r>
-            <w:r>
-              <w:rPr>
-                <w:noProof/>
-              </w:rPr>
               <w:instrText xml:space="preserve"> PAGEREF _Toc240729619 \h </w:instrText>
-            </w:r>
-            <w:r>
-              <w:rPr>
-                <w:noProof/>
-              </w:rPr>
-            </w:r>
-            <w:r>
-              <w:rPr>
-                <w:noProof/>
-              </w:rPr>
               <w:fldChar w:fldCharType="separate"/>
-            </w:r>
-            <w:r>
-              <w:rPr>
-                <w:noProof/>
-              </w:rPr>
               <w:t>33</w:t>
-            </w:r>
-            <w:r>
-              <w:rPr>
-                <w:noProof/>
-              </w:rPr>
               <w:fldChar w:fldCharType="end"/>
             </w:r>
           </w:hyperlink>
@@ -3318,40 +1904,10 @@
                 <w:noProof/>
               </w:rPr>
               <w:tab/>
-            </w:r>
-            <w:r>
-              <w:rPr>
-                <w:noProof/>
-              </w:rPr>
               <w:fldChar w:fldCharType="begin"/>
-            </w:r>
-            <w:r>
-              <w:rPr>
-                <w:noProof/>
-              </w:rPr>
               <w:instrText xml:space="preserve"> PAGEREF _Toc240729620 \h </w:instrText>
-            </w:r>
-            <w:r>
-              <w:rPr>
-                <w:noProof/>
-              </w:rPr>
-            </w:r>
-            <w:r>
-              <w:rPr>
-                <w:noProof/>
-              </w:rPr>
               <w:fldChar w:fldCharType="separate"/>
-            </w:r>
-            <w:r>
-              <w:rPr>
-                <w:noProof/>
-              </w:rPr>
               <w:t>33</w:t>
-            </w:r>
-            <w:r>
-              <w:rPr>
-                <w:noProof/>
-              </w:rPr>
               <w:fldChar w:fldCharType="end"/>
             </w:r>
           </w:hyperlink>
@@ -3379,40 +1935,10 @@
                 <w:noProof/>
               </w:rPr>
               <w:tab/>
-            </w:r>
-            <w:r>
-              <w:rPr>
-                <w:noProof/>
-              </w:rPr>
               <w:fldChar w:fldCharType="begin"/>
-            </w:r>
-            <w:r>
-              <w:rPr>
-                <w:noProof/>
-              </w:rPr>
               <w:instrText xml:space="preserve"> PAGEREF _Toc240729621 \h </w:instrText>
-            </w:r>
-            <w:r>
-              <w:rPr>
-                <w:noProof/>
-              </w:rPr>
-            </w:r>
-            <w:r>
-              <w:rPr>
-                <w:noProof/>
-              </w:rPr>
               <w:fldChar w:fldCharType="separate"/>
-            </w:r>
-            <w:r>
-              <w:rPr>
-                <w:noProof/>
-              </w:rPr>
               <w:t>34</w:t>
-            </w:r>
-            <w:r>
-              <w:rPr>
-                <w:noProof/>
-              </w:rPr>
               <w:fldChar w:fldCharType="end"/>
             </w:r>
           </w:hyperlink>
@@ -3440,40 +1966,10 @@
                 <w:noProof/>
               </w:rPr>
               <w:tab/>
-            </w:r>
-            <w:r>
-              <w:rPr>
-                <w:noProof/>
-              </w:rPr>
               <w:fldChar w:fldCharType="begin"/>
-            </w:r>
-            <w:r>
-              <w:rPr>
-                <w:noProof/>
-              </w:rPr>
               <w:instrText xml:space="preserve"> PAGEREF _Toc240729622 \h </w:instrText>
-            </w:r>
-            <w:r>
-              <w:rPr>
-                <w:noProof/>
-              </w:rPr>
-            </w:r>
-            <w:r>
-              <w:rPr>
-                <w:noProof/>
-              </w:rPr>
               <w:fldChar w:fldCharType="separate"/>
-            </w:r>
-            <w:r>
-              <w:rPr>
-                <w:noProof/>
-              </w:rPr>
               <w:t>36</w:t>
-            </w:r>
-            <w:r>
-              <w:rPr>
-                <w:noProof/>
-              </w:rPr>
               <w:fldChar w:fldCharType="end"/>
             </w:r>
           </w:hyperlink>
@@ -6161,7 +4657,20 @@
         <w:spacing w:after="70" w:line="264" w:lineRule="auto"/>
       </w:pPr>
       <w:r>
-        <w:t>Read the poll_checkpoint row for this source (BACKLOG or REALTIME) to obtain last_page and last_received_date.</w:t>
+        <w:t xml:space="preserve">Read the poll_checkpoint row for this source (BACKLOG or REALTIME) to obtain </w:t>
+      </w:r>
+      <w:del w:id="1001" w:author="Claude" w:date="2026-09-23T00:00:00Z">
+        <w:r>
+          <w:delText>last_page</w:delText>
+        </w:r>
+      </w:del>
+      <w:ins w:id="1002" w:author="Claude" w:date="2026-09-23T00:00:00Z">
+        <w:r>
+          <w:t>last_cursor</w:t>
+        </w:r>
+      </w:ins>
+      <w:r>
+        <w:t xml:space="preserve"> and last_received_date.</w:t>
       </w:r>
     </w:p>
     <w:p>
@@ -6188,8 +4697,6 @@
       </w:pPr>
       <w:r>
         <w:t xml:space="preserve">For each entry in the value array, upsert one dmer_document row. The upsert is keyed on document_guid and is the single most important idempotency guarantee in the system: it is what </w:t>
-      </w:r>
-      <w:r>
         <w:lastRenderedPageBreak/>
         <w:t>makes it safe for the poller to see the same document repeatedly, for the webhook to deliver a duplicate, and for a failed run to be repeated.</w:t>
       </w:r>
@@ -6256,7 +4763,20 @@
         <w:spacing w:after="70" w:line="264" w:lineRule="auto"/>
       </w:pPr>
       <w:r>
-        <w:t>Update poll_checkpoint with last_page, last_received_date and last_run_at.</w:t>
+        <w:t xml:space="preserve">Update poll_checkpoint with </w:t>
+      </w:r>
+      <w:del w:id="1003" w:author="Claude" w:date="2026-09-23T00:00:00Z">
+        <w:r>
+          <w:delText>last_page</w:delText>
+        </w:r>
+      </w:del>
+      <w:ins w:id="1004" w:author="Claude" w:date="2026-09-23T00:00:00Z">
+        <w:r>
+          <w:t>last_cursor</w:t>
+        </w:r>
+      </w:ins>
+      <w:r>
+        <w:t xml:space="preserve">, last_received_date and last_run_at.</w:t>
       </w:r>
     </w:p>
     <w:p>
@@ -6470,7 +4990,23 @@
                 <w:sz w:val="19"/>
                 <w:szCs w:val="19"/>
               </w:rPr>
-              <w:t>id (generated), document_guid, document_name, mercury_document_status, document_priority, received_date, dps_date, queue, business_area, mercury_case_id, driver_key (when Mercury supplied a driver), correlation_id (generated once, constant for the life of the document), pipeline_status = RECEIVED, current_stage = INGEST, attempt_count = 0, first_seen_at, updated_at</w:t>
+              <w:t xml:space="preserve">id (generated), document_guid, document_name, mercury_document_status, document_priority, received_date, dps_date, queue, business_area, mercury_case_id, driver_key (when Mercury supplied a driver), </w:t>
+            </w:r>
+            <w:del w:id="1007" w:author="Claude" w:date="2026-09-23T00:00:00Z">
+              <w:r>
+                <w:rPr>
+                  <w:sz w:val="19"/>
+                  <w:szCs w:val="19"/>
+                </w:rPr>
+                <w:delText xml:space="preserve">correlation_id (generated once, constant for the life of the document), </w:delText>
+              </w:r>
+            </w:del>
+            <w:r>
+              <w:rPr>
+                <w:sz w:val="19"/>
+                <w:szCs w:val="19"/>
+              </w:rPr>
+              <w:t xml:space="preserve">pipeline_status = RECEIVED, current_stage = INGEST, attempt_count = 0, first_seen_at, updated_at</w:t>
             </w:r>
           </w:p>
         </w:tc>
@@ -6641,7 +5177,32 @@
                 <w:sz w:val="19"/>
                 <w:szCs w:val="19"/>
               </w:rPr>
-              <w:t>source, last_page, last_received_date, last_run_at</w:t>
+              <w:t xml:space="preserve">source, </w:t>
+            </w:r>
+            <w:del w:id="1005" w:author="Claude" w:date="2026-09-23T00:00:00Z">
+              <w:r>
+                <w:rPr>
+                  <w:sz w:val="19"/>
+                  <w:szCs w:val="19"/>
+                </w:rPr>
+                <w:delText>last_page</w:delText>
+              </w:r>
+            </w:del>
+            <w:ins w:id="1006" w:author="Claude" w:date="2026-09-23T00:00:00Z">
+              <w:r>
+                <w:rPr>
+                  <w:sz w:val="19"/>
+                  <w:szCs w:val="19"/>
+                </w:rPr>
+                <w:t>last_cursor</w:t>
+              </w:r>
+            </w:ins>
+            <w:r>
+              <w:rPr>
+                <w:sz w:val="19"/>
+                <w:szCs w:val="19"/>
+              </w:rPr>
+              <w:t xml:space="preserve">, last_received_date, last_run_at</w:t>
             </w:r>
           </w:p>
         </w:tc>
@@ -8671,8 +7232,6 @@
       </w:r>
       <w:r>
         <w:t xml:space="preserve">HTTP 429 from Document Intelligence or Azure OpenAI is transient and must be retried inside the handler with exponential backoff, never by abandoning the message, because abandoning consumes delivery count and will dead-letter a perfectly good document during a busy period. An unreadable </w:t>
-      </w:r>
-      <w:r>
         <w:lastRenderedPageBreak/>
         <w:t>or malformed PDF is poison: dead-letter it explicitly with a reason rather than retrying five times. Renew the Service Bus lock while extraction runs, or a slow document will be redelivered while it is still being processed.</w:t>
       </w:r>
@@ -9009,8 +7568,6 @@
       </w:pPr>
       <w:r>
         <w:t xml:space="preserve">Because the Azure OpenAI endpoint is reachable with a key, this is a direct SDK call from the activity and no container app is required. If the endpoint later moves to a private endpoint, an Azure Function on Flex </w:t>
-      </w:r>
-      <w:r>
         <w:lastRenderedPageBreak/>
         <w:t>Consumption or Premium with VNet integration reaches private endpoints, so the hosting decision does not change either way.</w:t>
       </w:r>
@@ -10521,8 +9078,6 @@
       </w:r>
       <w:r>
         <w:t xml:space="preserve">Use a Service Bus session with SessionId = driver_key on the driver-decision queue, or a Durable Entity keyed on driver_key. Either gives single-writer semantics for free. A Postgres advisory lock — pg_advisory_xact_lock(hashtext(licence)) — is a valid third option if the </w:t>
-      </w:r>
-      <w:r>
         <w:lastRenderedPageBreak/>
         <w:t>team prefers the coordination to live in the database. Pick one and document it; mixing them gives the illusion of safety without the guarantee.</w:t>
       </w:r>
@@ -16152,15 +14707,20 @@
         <w:shd w:val="clear" w:color="auto" w:fill="F4F5F7"/>
         <w:spacing w:line="232" w:lineRule="auto"/>
         <w:ind w:left="200" w:right="200"/>
+        <w:rPr>
+          <w:del w:id="1008" w:author="Claude" w:date="2026-09-23T00:00:00Z"/>
+        </w:rPr>
       </w:pPr>
-      <w:r>
-        <w:rPr>
-          <w:rFonts w:ascii="Consolas" w:eastAsia="Consolas" w:hAnsi="Consolas" w:cs="Consolas"/>
-          <w:sz w:val="17"/>
-          <w:szCs w:val="17"/>
-        </w:rPr>
-        <w:t xml:space="preserve">  "correlation_id": "5d10...",            // constant for the life of the document</w:t>
-      </w:r>
+      <w:del w:id="1009" w:author="Claude" w:date="2026-09-23T00:00:00Z">
+        <w:r>
+          <w:rPr>
+            <w:rFonts w:ascii="Consolas" w:eastAsia="Consolas" w:hAnsi="Consolas" w:cs="Consolas"/>
+            <w:sz w:val="17"/>
+            <w:szCs w:val="17"/>
+          </w:rPr>
+          <w:delText xml:space="preserve">  "correlation_id": "5d10...",            // constant for the life of the document</w:delText>
+        </w:r>
+      </w:del>
     </w:p>
     <w:p>
       <w:pPr>
@@ -17563,50 +16123,97 @@
         <w:spacing w:before="160" w:after="80"/>
         <w:jc w:val="center"/>
       </w:pPr>
-      <w:r>
-        <w:rPr>
-          <w:noProof/>
-        </w:rPr>
-        <w:lastRenderedPageBreak/>
-        <w:drawing>
-          <wp:inline distT="0" distB="0" distL="0" distR="0" wp14:anchorId="7AC6B2AC" wp14:editId="33C1679F">
-            <wp:extent cx="5029200" cy="8229600"/>
-            <wp:effectExtent l="0" t="0" r="0" b="0"/>
-            <wp:docPr id="467784945" name="Picture 467784945"/>
-            <wp:cNvGraphicFramePr>
-              <a:graphicFrameLocks xmlns:a="http://schemas.openxmlformats.org/drawingml/2006/main" noChangeAspect="1"/>
-            </wp:cNvGraphicFramePr>
-            <a:graphic xmlns:a="http://schemas.openxmlformats.org/drawingml/2006/main">
-              <a:graphicData uri="http://schemas.openxmlformats.org/drawingml/2006/picture">
-                <pic:pic xmlns:pic="http://schemas.openxmlformats.org/drawingml/2006/picture">
-                  <pic:nvPicPr>
-                    <pic:cNvPr id="0" name=""/>
-                    <pic:cNvPicPr>
-                      <a:picLocks noChangeAspect="1" noChangeArrowheads="1"/>
-                    </pic:cNvPicPr>
-                  </pic:nvPicPr>
-                  <pic:blipFill>
-                    <a:blip r:embed="rId8"/>
-                    <a:srcRect/>
-                    <a:stretch>
-                      <a:fillRect/>
-                    </a:stretch>
-                  </pic:blipFill>
-                  <pic:spPr bwMode="auto">
-                    <a:xfrm>
-                      <a:off x="0" y="0"/>
-                      <a:ext cx="5029200" cy="8229600"/>
-                    </a:xfrm>
-                    <a:prstGeom prst="rect">
-                      <a:avLst/>
-                    </a:prstGeom>
-                  </pic:spPr>
-                </pic:pic>
-              </a:graphicData>
-            </a:graphic>
-          </wp:inline>
-        </w:drawing>
-      </w:r>
+      <w:del w:id="1010" w:author="Claude" w:date="2026-09-23T00:00:00Z">
+        <w:r>
+          <w:rPr>
+            <w:noProof/>
+          </w:rPr>
+          <w:lastRenderedPageBreak/>
+          <w:drawing>
+            <wp:inline distT="0" distB="0" distL="0" distR="0" wp14:anchorId="7AC6B2AC" wp14:editId="33C1679F">
+              <wp:extent cx="5029200" cy="8229600"/>
+              <wp:effectExtent l="0" t="0" r="0" b="0"/>
+              <wp:docPr id="467784945" name="Picture 467784945"/>
+              <wp:cNvGraphicFramePr>
+                <a:graphicFrameLocks xmlns:a="http://schemas.openxmlformats.org/drawingml/2006/main" noChangeAspect="1"/>
+              </wp:cNvGraphicFramePr>
+              <a:graphic xmlns:a="http://schemas.openxmlformats.org/drawingml/2006/main">
+                <a:graphicData uri="http://schemas.openxmlformats.org/drawingml/2006/picture">
+                  <pic:pic xmlns:pic="http://schemas.openxmlformats.org/drawingml/2006/picture">
+                    <pic:nvPicPr>
+                      <pic:cNvPr id="0" name=""/>
+                      <pic:cNvPicPr>
+                        <a:picLocks noChangeAspect="1" noChangeArrowheads="1"/>
+                      </pic:cNvPicPr>
+                    </pic:nvPicPr>
+                    <pic:blipFill>
+                      <a:blip r:embed="rId8"/>
+                      <a:srcRect/>
+                      <a:stretch>
+                        <a:fillRect/>
+                      </a:stretch>
+                    </pic:blipFill>
+                    <pic:spPr bwMode="auto">
+                      <a:xfrm>
+                        <a:off x="0" y="0"/>
+                        <a:ext cx="5029200" cy="8229600"/>
+                      </a:xfrm>
+                      <a:prstGeom prst="rect">
+                        <a:avLst/>
+                      </a:prstGeom>
+                    </pic:spPr>
+                  </pic:pic>
+                </a:graphicData>
+              </a:graphic>
+            </wp:inline>
+          </w:drawing>
+        </w:r>
+      </w:del>
+      <w:ins w:id="1011" w:author="Claude" w:date="2026-09-23T00:00:00Z">
+        <w:r>
+          <w:rPr>
+            <w:noProof/>
+          </w:rPr>
+          <w:drawing>
+            <wp:inline distT="0" distB="0" distL="0" distR="0" wp14:anchorId="7AC6B2AD" wp14:editId="33C1679E">
+              <wp:extent cx="5943600" cy="3495800"/>
+              <wp:effectExtent l="0" t="0" r="0" b="0"/>
+              <wp:docPr id="700000001" name="Picture 700000001"/>
+              <wp:cNvGraphicFramePr>
+                <a:graphicFrameLocks xmlns:a="http://schemas.openxmlformats.org/drawingml/2006/main" noChangeAspect="1"/>
+              </wp:cNvGraphicFramePr>
+              <a:graphic xmlns:a="http://schemas.openxmlformats.org/drawingml/2006/main">
+                <a:graphicData uri="http://schemas.openxmlformats.org/drawingml/2006/picture">
+                  <pic:pic xmlns:pic="http://schemas.openxmlformats.org/drawingml/2006/picture">
+                    <pic:nvPicPr>
+                      <pic:cNvPr id="0" name=""/>
+                      <pic:cNvPicPr>
+                        <a:picLocks noChangeAspect="1" noChangeArrowheads="1"/>
+                      </pic:cNvPicPr>
+                    </pic:nvPicPr>
+                    <pic:blipFill>
+                      <a:blip r:embed="rId14"/>
+                      <a:srcRect/>
+                      <a:stretch>
+                        <a:fillRect/>
+                      </a:stretch>
+                    </pic:blipFill>
+                    <pic:spPr bwMode="auto">
+                      <a:xfrm>
+                        <a:off x="0" y="0"/>
+                        <a:ext cx="5943600" cy="3495800"/>
+                      </a:xfrm>
+                      <a:prstGeom prst="rect">
+                        <a:avLst/>
+                      </a:prstGeom>
+                    </pic:spPr>
+                  </pic:pic>
+                </a:graphicData>
+              </a:graphic>
+            </wp:inline>
+          </w:drawing>
+        </w:r>
+      </w:ins>
     </w:p>
     <w:p>
       <w:pPr>
@@ -19345,8 +17952,6 @@
       </w:pPr>
       <w:r>
         <w:t xml:space="preserve">Query Mercury for documents in the DPS queues with an empty dps_date and compare against dmer_decision. Anything present in Mercury with no decision, or with a decision that was never posted, </w:t>
-      </w:r>
-      <w:r>
         <w:lastRenderedPageBreak/>
         <w:t>appears on the report. Run this from the first day in production rather than adding it after the first incident; it is the evidence that the guarantee holds.</w:t>
       </w:r>
@@ -20515,21 +19120,7 @@
                 <w:sz w:val="19"/>
                 <w:szCs w:val="19"/>
               </w:rPr>
-              <w:t xml:space="preserve">Yes, default to IN and add </w:t>
-            </w:r>
-            <w:r>
-              <w:rPr>
-                <w:sz w:val="19"/>
-                <w:szCs w:val="19"/>
-              </w:rPr>
-              <w:t>"AI could not process"</w:t>
-            </w:r>
-            <w:r>
-              <w:rPr>
-                <w:sz w:val="19"/>
-                <w:szCs w:val="19"/>
-              </w:rPr>
-              <w:t xml:space="preserve"> as comment.</w:t>
+              <w:t xml:space="preserve">Yes, default to IN and add "AI could not process" as comment.</w:t>
             </w:r>
           </w:p>
           <w:p>
@@ -20751,21 +19342,7 @@
                 <w:sz w:val="19"/>
                 <w:szCs w:val="19"/>
               </w:rPr>
-              <w:t>T</w:t>
-            </w:r>
-            <w:r>
-              <w:rPr>
-                <w:sz w:val="19"/>
-                <w:szCs w:val="19"/>
-              </w:rPr>
-              <w:t>he rule engine decide PR / PU / PCM / CR entirely from medical content</w:t>
-            </w:r>
-            <w:r>
-              <w:rPr>
-                <w:sz w:val="19"/>
-                <w:szCs w:val="19"/>
-              </w:rPr>
-              <w:t>.</w:t>
+              <w:t>The rule engine decide PR / PU / PCM / CR entirely from medical content.</w:t>
             </w:r>
           </w:p>
         </w:tc>
@@ -21282,21 +19859,7 @@
                 <w:sz w:val="19"/>
                 <w:szCs w:val="19"/>
               </w:rPr>
-              <w:t xml:space="preserve">Yes, it can count toward </w:t>
-            </w:r>
-            <w:r>
-              <w:rPr>
-                <w:sz w:val="19"/>
-                <w:szCs w:val="19"/>
-              </w:rPr>
-              <w:t>"all documents processed"</w:t>
-            </w:r>
-            <w:r>
-              <w:rPr>
-                <w:sz w:val="19"/>
-                <w:szCs w:val="19"/>
-              </w:rPr>
-              <w:t>.</w:t>
+              <w:t xml:space="preserve">Yes, it can count toward "all documents processed".</w:t>
             </w:r>
           </w:p>
         </w:tc>
@@ -21397,35 +19960,7 @@
                 <w:sz w:val="19"/>
                 <w:szCs w:val="19"/>
               </w:rPr>
-              <w:t>Dps_date will get updated after the human review. A</w:t>
-            </w:r>
-            <w:r>
-              <w:rPr>
-                <w:sz w:val="19"/>
-                <w:szCs w:val="19"/>
-              </w:rPr>
-              <w:t xml:space="preserve">n empty dps_date </w:t>
-            </w:r>
-            <w:r>
-              <w:rPr>
-                <w:sz w:val="19"/>
-                <w:szCs w:val="19"/>
-              </w:rPr>
-              <w:t xml:space="preserve">is </w:t>
-            </w:r>
-            <w:r>
-              <w:rPr>
-                <w:sz w:val="19"/>
-                <w:szCs w:val="19"/>
-              </w:rPr>
-              <w:t>a reliable signal of "not yet triaged"</w:t>
-            </w:r>
-            <w:r>
-              <w:rPr>
-                <w:sz w:val="19"/>
-                <w:szCs w:val="19"/>
-              </w:rPr>
-              <w:t>.</w:t>
+              <w:t xml:space="preserve">Dps_date will get updated after the human review. An empty dps_date is a reliable signal of "not yet triaged".</w:t>
             </w:r>
           </w:p>
         </w:tc>
@@ -22617,37 +21152,14 @@
                 <w:sz w:val="19"/>
                 <w:szCs w:val="19"/>
               </w:rPr>
-              <w:t>Cursor-Based Pagination</w:t>
-            </w:r>
-            <w:r>
-              <w:rPr>
-                <w:b/>
-                <w:bCs/>
-                <w:sz w:val="19"/>
-                <w:szCs w:val="19"/>
-              </w:rPr>
-              <w:t xml:space="preserve">. </w:t>
-            </w:r>
-            <w:r>
-              <w:rPr>
-                <w:sz w:val="19"/>
-                <w:szCs w:val="19"/>
-              </w:rPr>
-              <w:t xml:space="preserve">Below </w:t>
-            </w:r>
-            <w:r>
-              <w:rPr>
-                <w:sz w:val="19"/>
-                <w:szCs w:val="19"/>
-              </w:rPr>
-              <w:t>fields</w:t>
-            </w:r>
-            <w:r>
-              <w:rPr>
-                <w:sz w:val="19"/>
-                <w:szCs w:val="19"/>
-              </w:rPr>
-              <w:t xml:space="preserve"> will be part of each response.</w:t>
+              <w:t xml:space="preserve">Cursor-Based Pagination. </w:t>
+            </w:r>
+            <w:r>
+              <w:rPr>
+                <w:sz w:val="19"/>
+                <w:szCs w:val="19"/>
+              </w:rPr>
+              <w:t xml:space="preserve">Below fields will be part of each response.</w:t>
             </w:r>
           </w:p>
           <w:p>
@@ -22986,21 +21498,7 @@
                 <w:sz w:val="19"/>
                 <w:szCs w:val="19"/>
               </w:rPr>
-              <w:t xml:space="preserve">It will </w:t>
-            </w:r>
-            <w:r>
-              <w:rPr>
-                <w:sz w:val="19"/>
-                <w:szCs w:val="19"/>
-              </w:rPr>
-              <w:t xml:space="preserve">return </w:t>
-            </w:r>
-            <w:r>
-              <w:rPr>
-                <w:sz w:val="19"/>
-                <w:szCs w:val="19"/>
-              </w:rPr>
-              <w:t>only DMERs.</w:t>
+              <w:t xml:space="preserve">It will return only DMERs.</w:t>
             </w:r>
           </w:p>
         </w:tc>
@@ -23412,21 +21910,7 @@
                 <w:sz w:val="19"/>
                 <w:szCs w:val="19"/>
               </w:rPr>
-              <w:t xml:space="preserve">No, there won’t be multiple DMERs in one PDF. One pdf per DMER. Also, there won’t be one DMER split across </w:t>
-            </w:r>
-            <w:r>
-              <w:rPr>
-                <w:sz w:val="19"/>
-                <w:szCs w:val="19"/>
-              </w:rPr>
-              <w:t xml:space="preserve">several </w:t>
-            </w:r>
-            <w:r>
-              <w:rPr>
-                <w:sz w:val="19"/>
-                <w:szCs w:val="19"/>
-              </w:rPr>
-              <w:t>files.</w:t>
+              <w:t xml:space="preserve">No, there won’t be multiple DMERs in one PDF. One pdf per DMER. Also, there won’t be one DMER split across several files.</w:t>
             </w:r>
           </w:p>
         </w:tc>

</xml_diff>